<commit_message>
Fix load test fixtures: PDFs now produce valid chunks
The hand-crafted PDFs had too little text per page (<20 words),
causing the chunker to reject all content. This meant the NEW_RFP
document had 0 chunks indexed, making generate_structure fail
immediately with "Aucun document de nouvel appel d'offres indexe".

Replaced with realistic RFP content (~650 words across 3 pages for
the main RFP) using proper PDF text operators. DOCX fixtures also
get richer content matching a real technical response.

https://claude.ai/code/session_01JNPchZ3tUEEWcP4sM95Uba
</commit_message>
<xml_diff>
--- a/loadtest/fixtures/sample_old_response.docx
+++ b/loadtest/fixtures/sample_old_response.docx
@@ -4,67 +4,87 @@
   <ns0:body>
     <ns0:p>
       <ns0:r>
-        <ns0:t>Ancienne Reponse - Projet Digital</ns0:t>
+        <ns0:t>ANCIENNE REPONSE TECHNIQUE - PROJET DE TRANSFORMATION DIGITALE</ns0:t>
       </ns0:r>
     </ns0:p>
     <ns0:p>
       <ns0:r>
-        <ns0:t>1. Objet du marche</ns0:t>
+        <ns0:t/>
       </ns0:r>
     </ns0:p>
     <ns0:p>
       <ns0:r>
-        <ns0:t>Le present appel d'offres a pour objet la selection d'un prestataire pour la mise en oeuvre d'une solution de gestion documentaire integree.</ns0:t>
+        <ns0:t>1. CONTEXTE DE NOTRE INTERVENTION</ns0:t>
       </ns0:r>
     </ns0:p>
     <ns0:p>
       <ns0:r>
-        <ns0:t>2. Contexte et enjeux</ns0:t>
+        <ns0:t/>
       </ns0:r>
     </ns0:p>
     <ns0:p>
       <ns0:r>
-        <ns0:t>Notre organisation souhaite moderniser ses processus de gestion documentaire afin d'ameliorer l'efficacite operationnelle.</ns0:t>
+        <ns0:t>Suite a votre consultation, nous avons le plaisir de vous presenter notre proposition pour l'accompagnement de votre transformation digitale. Notre equipe possede une expertise reconnue dans la mise en oeuvre de solutions Microsoft 365, Salesforce et les outils de digitalisation des processus RH.</ns0:t>
       </ns0:r>
     </ns0:p>
     <ns0:p>
       <ns0:r>
-        <ns0:t>3. Perimetre de la prestation</ns0:t>
+        <ns0:t/>
       </ns0:r>
     </ns0:p>
     <ns0:p>
       <ns0:r>
-        <ns0:t>Le prestataire devra fournir : analyse des besoins, conception de la solution, developpement, integration, formation des utilisateurs, et maintenance.</ns0:t>
+        <ns0:t>2. SOLUTION PROPOSEE</ns0:t>
       </ns0:r>
     </ns0:p>
     <ns0:p>
       <ns0:r>
-        <ns0:t>4. Criteres d'evaluation</ns0:t>
+        <ns0:t/>
       </ns0:r>
     </ns0:p>
     <ns0:p>
       <ns0:r>
-        <ns0:t>Les offres seront evaluees selon : qualite technique (40%), references (20%), prix (30%), delais (10%).</ns0:t>
+        <ns0:t>Nous proposons une approche en trois phases : diagnostic des usages actuels, conception de la solution cible integrant Microsoft 365 comme socle collaboratif et Salesforce comme CRM, puis deploiement progressif par direction. Cette approche permet de valider chaque etape avant de passer a la suivante et de limiter les risques de regression.</ns0:t>
       </ns0:r>
     </ns0:p>
     <ns0:p>
       <ns0:r>
-        <ns0:t>5. Calendrier previsionnel</ns0:t>
+        <ns0:t/>
       </ns0:r>
     </ns0:p>
     <ns0:p>
       <ns0:r>
-        <ns0:t>Phase 1 : Cadrage - 2 mois. Phase 2 : Realisation - 6 mois. Phase 3 : Deploiement - 2 mois.</ns0:t>
+        <ns0:t>3. LIVRABLES PRINCIPAUX</ns0:t>
       </ns0:r>
     </ns0:p>
     <ns0:p>
       <ns0:r>
-        <ns0:t>6. Budget</ns0:t>
+        <ns0:t/>
       </ns0:r>
     </ns0:p>
     <ns0:p>
       <ns0:r>
-        <ns0:t>Le budget previsionnel est de 350 000 EUR HT, hors frais de maintenance annuelle.</ns0:t>
+        <ns0:t>Les livrables incluent : le rapport d'audit initial, le dossier d'architecture technique, les specifications fonctionnelles detaillees, les manuels utilisateur, le plan de formation et le dossier de recette. Chaque livrable sera soumis a validation avant passage a l'etape suivante conformement a notre methodologie qualite certifiee ISO 9001.</ns0:t>
+      </ns0:r>
+    </ns0:p>
+    <ns0:p>
+      <ns0:r>
+        <ns0:t/>
+      </ns0:r>
+    </ns0:p>
+    <ns0:p>
+      <ns0:r>
+        <ns0:t>4. PROPOSITION FINANCIERE</ns0:t>
+      </ns0:r>
+    </ns0:p>
+    <ns0:p>
+      <ns0:r>
+        <ns0:t/>
+      </ns0:r>
+    </ns0:p>
+    <ns0:p>
+      <ns0:r>
+        <ns0:t>Notre proposition financiere s'eleve a 750 000 EUR HT decomposee comme suit : phase de diagnostic 80 000 EUR, phase de conception 120 000 EUR, phase de realisation 400 000 EUR, phase de deploiement et formation 150 000 EUR. Ce montant inclut la garantie de 12 mois post-mise en production.</ns0:t>
       </ns0:r>
     </ns0:p>
   </ns0:body>

</xml_diff>